<commit_message>
docs: update User Guide to v1.4.0 (search-on-Enter, all-mode phrase search, i18n models)
- Version tag v1.0.3 -> v1.4.0.
- Search now runs on Enter (v1.3.0), not as-you-type — corrected the
  Searching section.
- Phrase search (quotes) works in ALL modes now, not Keyword-only: presence
  filter + meaning-rank in Semantic/Both. Updated the Phrase Search section and
  the matching troubleshooting entry.
- Synopsis troubleshooting no longer hardcodes nomic/dolphin3 — generalized for
  the configured language (multi-language).
- Regenerated User_Guide.docx from the updated markdown.

Co-Authored-By: Claude Opus 4.8 <noreply@anthropic.com>
</commit_message>
<xml_diff>
--- a/EndUser_docs/User_Guide.docx
+++ b/EndUser_docs/User_Guide.docx
@@ -28,13 +28,13 @@
         </w:p>
       </w:sdtContent>
     </w:sdt>
-    <w:bookmarkStart w:id="38" w:name="docubrowse-v1.0.3-user-guide"/>
+    <w:bookmarkStart w:id="38" w:name="docubrowse-v1.4.0-user-guide"/>
     <w:p>
       <w:pPr>
         <w:pStyle w:val="Heading1"/>
       </w:pPr>
       <w:r>
-        <w:t xml:space="preserve">DocuBrowse v1.0.3 — User Guide</w:t>
+        <w:t xml:space="preserve">DocuBrowse v1.4.0 — User Guide</w:t>
       </w:r>
     </w:p>
     <w:p>
@@ -659,7 +659,23 @@
         <w:pStyle w:val="FirstParagraph"/>
       </w:pPr>
       <w:r>
-        <w:t xml:space="preserve">The search bar is at the top of the page, centered in the header. Start typing and results appear within a fraction of a second. You do not need to press Enter.</w:t>
+        <w:t xml:space="preserve">The search bar is at the top of the page, centered in the header. Type your query and press</w:t>
+      </w:r>
+      <w:r>
+        <w:t xml:space="preserve"> </w:t>
+      </w:r>
+      <w:r>
+        <w:rPr>
+          <w:b/>
+          <w:bCs/>
+        </w:rPr>
+        <w:t xml:space="preserve">Enter</w:t>
+      </w:r>
+      <w:r>
+        <w:t xml:space="preserve"> </w:t>
+      </w:r>
+      <w:r>
+        <w:t xml:space="preserve">to search — results appear within a fraction of a second. Clearing the search box shows all documents again.</w:t>
       </w:r>
     </w:p>
     <w:bookmarkStart w:id="12" w:name="search-modes-keyword-semantic-both"/>
@@ -867,7 +883,64 @@
         <w:pStyle w:val="FirstParagraph"/>
       </w:pPr>
       <w:r>
-        <w:t xml:space="preserve">In</w:t>
+        <w:t xml:space="preserve">Wrap a phrase in double quotes to require that exact sequence of words. For</w:t>
+      </w:r>
+      <w:r>
+        <w:t xml:space="preserve"> </w:t>
+      </w:r>
+      <w:r>
+        <w:t xml:space="preserve">example, typing</w:t>
+      </w:r>
+      <w:r>
+        <w:t xml:space="preserve"> </w:t>
+      </w:r>
+      <w:r>
+        <w:rPr>
+          <w:rStyle w:val="VerbatimChar"/>
+        </w:rPr>
+        <w:t xml:space="preserve">"import fmt"</w:t>
+      </w:r>
+      <w:r>
+        <w:t xml:space="preserve"> </w:t>
+      </w:r>
+      <w:r>
+        <w:t xml:space="preserve">finds documents containing that exact phrase —</w:t>
+      </w:r>
+      <w:r>
+        <w:t xml:space="preserve"> </w:t>
+      </w:r>
+      <w:r>
+        <w:t xml:space="preserve">useful for searching source code or technical documentation. Matching is</w:t>
+      </w:r>
+      <w:r>
+        <w:t xml:space="preserve"> </w:t>
+      </w:r>
+      <w:r>
+        <w:t xml:space="preserve">case-insensitive.</w:t>
+      </w:r>
+    </w:p>
+    <w:p>
+      <w:pPr>
+        <w:pStyle w:val="BodyText"/>
+      </w:pPr>
+      <w:r>
+        <w:t xml:space="preserve">Quotes work in</w:t>
+      </w:r>
+      <w:r>
+        <w:t xml:space="preserve"> </w:t>
+      </w:r>
+      <w:r>
+        <w:rPr>
+          <w:b/>
+          <w:bCs/>
+        </w:rPr>
+        <w:t xml:space="preserve">every</w:t>
+      </w:r>
+      <w:r>
+        <w:t xml:space="preserve"> </w:t>
+      </w:r>
+      <w:r>
+        <w:t xml:space="preserve">mode. In</w:t>
       </w:r>
       <w:r>
         <w:t xml:space="preserve"> </w:t>
@@ -883,15 +956,57 @@
         <w:t xml:space="preserve"> </w:t>
       </w:r>
       <w:r>
-        <w:t xml:space="preserve">mode only, you can wrap a phrase in double quotes to search for that exact sequence of words.</w:t>
-      </w:r>
-    </w:p>
-    <w:p>
-      <w:pPr>
-        <w:pStyle w:val="BodyText"/>
-      </w:pPr>
-      <w:r>
-        <w:t xml:space="preserve">For example, typing</w:t>
+        <w:t xml:space="preserve">mode the phrase must appear</w:t>
+      </w:r>
+      <w:r>
+        <w:t xml:space="preserve"> </w:t>
+      </w:r>
+      <w:r>
+        <w:t xml:space="preserve">literally. In</w:t>
+      </w:r>
+      <w:r>
+        <w:t xml:space="preserve"> </w:t>
+      </w:r>
+      <w:r>
+        <w:rPr>
+          <w:b/>
+          <w:bCs/>
+        </w:rPr>
+        <w:t xml:space="preserve">Semantic</w:t>
+      </w:r>
+      <w:r>
+        <w:t xml:space="preserve"> </w:t>
+      </w:r>
+      <w:r>
+        <w:t xml:space="preserve">and</w:t>
+      </w:r>
+      <w:r>
+        <w:t xml:space="preserve"> </w:t>
+      </w:r>
+      <w:r>
+        <w:rPr>
+          <w:b/>
+          <w:bCs/>
+        </w:rPr>
+        <w:t xml:space="preserve">Both</w:t>
+      </w:r>
+      <w:r>
+        <w:t xml:space="preserve"> </w:t>
+      </w:r>
+      <w:r>
+        <w:t xml:space="preserve">modes the quoted phrase acts as a</w:t>
+      </w:r>
+      <w:r>
+        <w:t xml:space="preserve"> </w:t>
+      </w:r>
+      <w:r>
+        <w:t xml:space="preserve">presence filter first — only documents that actually contain the phrase are</w:t>
+      </w:r>
+      <w:r>
+        <w:t xml:space="preserve"> </w:t>
+      </w:r>
+      <w:r>
+        <w:t xml:space="preserve">considered — and that set is then ranked by meaning. You can mix forms:</w:t>
       </w:r>
       <w:r>
         <w:t xml:space="preserve"> </w:t>
@@ -900,21 +1015,56 @@
         <w:rPr>
           <w:rStyle w:val="VerbatimChar"/>
         </w:rPr>
-        <w:t xml:space="preserve">"import fmt"</w:t>
-      </w:r>
-      <w:r>
-        <w:t xml:space="preserve"> </w:t>
-      </w:r>
-      <w:r>
-        <w:t xml:space="preserve">will find documents containing that exact phrase — useful for searching source code or technical documentation.</w:t>
-      </w:r>
-    </w:p>
-    <w:p>
-      <w:pPr>
-        <w:pStyle w:val="BodyText"/>
-      </w:pPr>
-      <w:r>
-        <w:t xml:space="preserve">Phrase search does not work in Semantic or Both modes. In those modes, the quotes are ignored and DocuBrowse searches by meaning instead.</w:t>
+        <w:t xml:space="preserve">golang "import fmt"</w:t>
+      </w:r>
+      <w:r>
+        <w:t xml:space="preserve"> </w:t>
+      </w:r>
+      <w:r>
+        <w:t xml:space="preserve">means</w:t>
+      </w:r>
+      <w:r>
+        <w:t xml:space="preserve"> </w:t>
+      </w:r>
+      <w:r>
+        <w:rPr>
+          <w:i/>
+          <w:iCs/>
+        </w:rPr>
+        <w:t xml:space="preserve">the phrase</w:t>
+      </w:r>
+      <w:r>
+        <w:rPr>
+          <w:i/>
+          <w:iCs/>
+        </w:rPr>
+        <w:t xml:space="preserve"> </w:t>
+      </w:r>
+      <w:r>
+        <w:rPr>
+          <w:i/>
+          <w:iCs/>
+        </w:rPr>
+        <w:t xml:space="preserve">“import fmt”</w:t>
+      </w:r>
+      <w:r>
+        <w:t xml:space="preserve"> </w:t>
+      </w:r>
+      <w:r>
+        <w:t xml:space="preserve">or the loose word</w:t>
+      </w:r>
+      <w:r>
+        <w:t xml:space="preserve"> </w:t>
+      </w:r>
+      <w:r>
+        <w:rPr>
+          <w:i/>
+          <w:iCs/>
+        </w:rPr>
+        <w:t xml:space="preserve">golang</w:t>
+      </w:r>
+      <w:r>
+        <w:t xml:space="preserve">.</w:t>
       </w:r>
     </w:p>
     <w:bookmarkEnd w:id="13"/>
@@ -3254,7 +3404,7 @@
         <w:pStyle w:val="FirstParagraph"/>
       </w:pPr>
       <w:r>
-        <w:t xml:space="preserve">Your administrator can resolve this by starting Ollama and ensuring both the</w:t>
+        <w:t xml:space="preserve">Your administrator can resolve this by starting Ollama and ensuring the AI models for the configured language are installed (English uses</w:t>
       </w:r>
       <w:r>
         <w:t xml:space="preserve"> </w:t>
@@ -3263,13 +3413,13 @@
         <w:rPr>
           <w:rStyle w:val="VerbatimChar"/>
         </w:rPr>
-        <w:t xml:space="preserve">nomic-embed-text:latest</w:t>
-      </w:r>
-      <w:r>
-        <w:t xml:space="preserve"> </w:t>
-      </w:r>
-      <w:r>
-        <w:t xml:space="preserve">and</w:t>
+        <w:t xml:space="preserve">nomic-embed-text</w:t>
+      </w:r>
+      <w:r>
+        <w:t xml:space="preserve"> </w:t>
+      </w:r>
+      <w:r>
+        <w:t xml:space="preserve">for search and</w:t>
       </w:r>
       <w:r>
         <w:t xml:space="preserve"> </w:t>
@@ -3278,13 +3428,13 @@
         <w:rPr>
           <w:rStyle w:val="VerbatimChar"/>
         </w:rPr>
-        <w:t xml:space="preserve">dolphin3:latest</w:t>
-      </w:r>
-      <w:r>
-        <w:t xml:space="preserve"> </w:t>
-      </w:r>
-      <w:r>
-        <w:t xml:space="preserve">models are installed.</w:t>
+        <w:t xml:space="preserve">dolphin3</w:t>
+      </w:r>
+      <w:r>
+        <w:t xml:space="preserve"> </w:t>
+      </w:r>
+      <w:r>
+        <w:t xml:space="preserve">for synopsis; other languages use different models, pulled automatically on first run).</w:t>
       </w:r>
     </w:p>
     <w:bookmarkEnd w:id="31"/>
@@ -3306,13 +3456,13 @@
       </w:r>
     </w:p>
     <w:bookmarkEnd w:id="32"/>
-    <w:bookmarkStart w:id="33" w:name="phrase-search-is-not-working"/>
+    <w:bookmarkStart w:id="33" w:name="X67c4ff60f9d533a0b5b973880d77624de42f105"/>
     <w:p>
       <w:pPr>
         <w:pStyle w:val="Heading3"/>
       </w:pPr>
       <w:r>
-        <w:t xml:space="preserve">Phrase search is not working</w:t>
+        <w:t xml:space="preserve">Phrase search is not matching what I expect</w:t>
       </w:r>
     </w:p>
     <w:p>
@@ -3335,7 +3485,19 @@
         <w:t xml:space="preserve"> </w:t>
       </w:r>
       <w:r>
-        <w:t xml:space="preserve">in double quotes — only works in</w:t>
+        <w:t xml:space="preserve">in double quotes — requires that the</w:t>
+      </w:r>
+      <w:r>
+        <w:t xml:space="preserve"> </w:t>
+      </w:r>
+      <w:r>
+        <w:t xml:space="preserve">words appear together in that exact order (matching is case-insensitive). It</w:t>
+      </w:r>
+      <w:r>
+        <w:t xml:space="preserve"> </w:t>
+      </w:r>
+      <w:r>
+        <w:t xml:space="preserve">works in every mode: in</w:t>
       </w:r>
       <w:r>
         <w:t xml:space="preserve"> </w:t>
@@ -3351,7 +3513,7 @@
         <w:t xml:space="preserve"> </w:t>
       </w:r>
       <w:r>
-        <w:t xml:space="preserve">mode. If you are in</w:t>
+        <w:t xml:space="preserve">mode it matches the literal phrase; in</w:t>
       </w:r>
       <w:r>
         <w:t xml:space="preserve"> </w:t>
@@ -3367,7 +3529,7 @@
         <w:t xml:space="preserve"> </w:t>
       </w:r>
       <w:r>
-        <w:t xml:space="preserve">or</w:t>
+        <w:t xml:space="preserve">and</w:t>
       </w:r>
       <w:r>
         <w:t xml:space="preserve"> </w:t>
@@ -3383,31 +3545,25 @@
         <w:t xml:space="preserve"> </w:t>
       </w:r>
       <w:r>
-        <w:t xml:space="preserve">mode, the quotes are ignored and the search runs by meaning instead.</w:t>
-      </w:r>
-    </w:p>
-    <w:p>
-      <w:pPr>
-        <w:pStyle w:val="BodyText"/>
-      </w:pPr>
-      <w:r>
-        <w:t xml:space="preserve">To use phrase search, click the</w:t>
-      </w:r>
-      <w:r>
-        <w:t xml:space="preserve"> </w:t>
-      </w:r>
-      <w:r>
-        <w:rPr>
-          <w:b/>
-          <w:bCs/>
-        </w:rPr>
-        <w:t xml:space="preserve">Keyword</w:t>
-      </w:r>
-      <w:r>
-        <w:t xml:space="preserve"> </w:t>
-      </w:r>
-      <w:r>
-        <w:t xml:space="preserve">button in the header to switch to Keyword mode, then enter your quoted phrase.</w:t>
+        <w:t xml:space="preserve">modes it first keeps only documents that contain the</w:t>
+      </w:r>
+      <w:r>
+        <w:t xml:space="preserve"> </w:t>
+      </w:r>
+      <w:r>
+        <w:t xml:space="preserve">phrase, then ranks them by meaning. If a quoted phrase returns nothing, no</w:t>
+      </w:r>
+      <w:r>
+        <w:t xml:space="preserve"> </w:t>
+      </w:r>
+      <w:r>
+        <w:t xml:space="preserve">document contains those words in that exact order — try removing the quotes or</w:t>
+      </w:r>
+      <w:r>
+        <w:t xml:space="preserve"> </w:t>
+      </w:r>
+      <w:r>
+        <w:t xml:space="preserve">using fewer words.</w:t>
       </w:r>
     </w:p>
     <w:bookmarkEnd w:id="33"/>

</xml_diff>